<commit_message>
Revert "Arreglo error cadenas + Nuevo caso de prueba"
This reverts commit edc1b2000b66be6f147b4e33ff02356862f6c5ce.
</commit_message>
<xml_diff>
--- a/Casos de prueba.docx
+++ b/Casos de prueba.docx
@@ -10,8 +10,8 @@
       </w:tblPr>
       <w:tblGrid>
         <w:gridCol w:w="1278"/>
-        <w:gridCol w:w="1150"/>
-        <w:gridCol w:w="8624"/>
+        <w:gridCol w:w="1097"/>
+        <w:gridCol w:w="8677"/>
       </w:tblGrid>
       <w:tr>
         <w:tc>
@@ -54,7 +54,7 @@
         </w:tc>
         <w:tc>
           <w:tcPr>
-            <w:tcW w:w="8624" w:type="dxa"/>
+            <w:tcW w:w="8767" w:type="dxa"/>
           </w:tcPr>
           <w:p>
             <w:pPr>
@@ -101,7 +101,7 @@
         </w:tc>
         <w:tc>
           <w:tcPr>
-            <w:tcW w:w="8624" w:type="dxa"/>
+            <w:tcW w:w="8767" w:type="dxa"/>
           </w:tcPr>
           <w:p>
             <w:pPr>
@@ -114,8 +114,8 @@
               </w:rPr>
               <w:drawing>
                 <wp:inline distT="0" distB="0" distL="0" distR="0" wp14:anchorId="54C49191" wp14:editId="14114C28">
-                  <wp:extent cx="5314531" cy="1009650"/>
-                  <wp:effectExtent l="0" t="0" r="635" b="0"/>
+                  <wp:extent cx="4610100" cy="1090056"/>
+                  <wp:effectExtent l="0" t="0" r="0" b="0"/>
                   <wp:docPr id="1" name="Imagen 1"/>
                   <wp:cNvGraphicFramePr>
                     <a:graphicFrameLocks xmlns:a="http://schemas.openxmlformats.org/drawingml/2006/main" noChangeAspect="1"/>
@@ -129,13 +129,13 @@
                         </pic:nvPicPr>
                         <pic:blipFill rotWithShape="1">
                           <a:blip r:embed="rId4"/>
-                          <a:srcRect l="4411" t="10981" r="63832" b="78287"/>
+                          <a:srcRect l="4411" t="10981" r="63512" b="75528"/>
                           <a:stretch/>
                         </pic:blipFill>
                         <pic:spPr bwMode="auto">
                           <a:xfrm>
                             <a:off x="0" y="0"/>
-                            <a:ext cx="5367921" cy="1019793"/>
+                            <a:ext cx="4640468" cy="1097237"/>
                           </a:xfrm>
                           <a:prstGeom prst="rect">
                             <a:avLst/>
@@ -187,7 +187,7 @@
         </w:tc>
         <w:tc>
           <w:tcPr>
-            <w:tcW w:w="8624" w:type="dxa"/>
+            <w:tcW w:w="8767" w:type="dxa"/>
           </w:tcPr>
           <w:p>
             <w:pPr>
@@ -204,7 +204,7 @@
               </w:rPr>
               <w:drawing>
                 <wp:inline distT="0" distB="0" distL="0" distR="0" wp14:anchorId="76A36442" wp14:editId="754A2DFC">
-                  <wp:extent cx="4705350" cy="1171575"/>
+                  <wp:extent cx="4610100" cy="1685925"/>
                   <wp:effectExtent l="0" t="0" r="0" b="9525"/>
                   <wp:docPr id="3" name="Imagen 3"/>
                   <wp:cNvGraphicFramePr>
@@ -219,13 +219,13 @@
                         </pic:nvPicPr>
                         <pic:blipFill rotWithShape="1">
                           <a:blip r:embed="rId5"/>
-                          <a:srcRect l="172" t="2849" r="27903" b="65296"/>
+                          <a:srcRect l="172" t="2849" r="29359" b="51311"/>
                           <a:stretch/>
                         </pic:blipFill>
                         <pic:spPr bwMode="auto">
                           <a:xfrm>
                             <a:off x="0" y="0"/>
-                            <a:ext cx="4705964" cy="1171728"/>
+                            <a:ext cx="4610702" cy="1686145"/>
                           </a:xfrm>
                           <a:prstGeom prst="rect">
                             <a:avLst/>
@@ -277,7 +277,7 @@
         </w:tc>
         <w:tc>
           <w:tcPr>
-            <w:tcW w:w="8624" w:type="dxa"/>
+            <w:tcW w:w="8767" w:type="dxa"/>
           </w:tcPr>
           <w:p>
             <w:pPr>
@@ -423,6 +423,8 @@
             <w:r>
               <w:t xml:space="preserve"> si no ingresa nada</w:t>
             </w:r>
+            <w:bookmarkStart w:id="0" w:name="_GoBack"/>
+            <w:bookmarkEnd w:id="0"/>
             <w:r>
               <w:t>, porque llegó a la secuencia original de todas formas</w:t>
             </w:r>
@@ -430,7 +432,7 @@
         </w:tc>
         <w:tc>
           <w:tcPr>
-            <w:tcW w:w="8624" w:type="dxa"/>
+            <w:tcW w:w="8767" w:type="dxa"/>
           </w:tcPr>
           <w:p>
             <w:pPr>
@@ -605,176 +607,7 @@
           </w:p>
         </w:tc>
       </w:tr>
-      <w:tr>
-        <w:tc>
-          <w:tcPr>
-            <w:tcW w:w="0" w:type="auto"/>
-          </w:tcPr>
-          <w:p>
-            <w:pPr>
-              <w:jc w:val="both"/>
-            </w:pPr>
-            <w:r>
-              <w:t>Todos los jugadores terminan con 0 puntos.</w:t>
-            </w:r>
-          </w:p>
-        </w:tc>
-        <w:tc>
-          <w:tcPr>
-            <w:tcW w:w="0" w:type="auto"/>
-          </w:tcPr>
-          <w:p>
-            <w:pPr>
-              <w:jc w:val="both"/>
-            </w:pPr>
-            <w:r>
-              <w:t>Todos son ganadores porque 0 sería el máximo de puntos que se alcanzó</w:t>
-            </w:r>
-          </w:p>
-        </w:tc>
-        <w:tc>
-          <w:tcPr>
-            <w:tcW w:w="8624" w:type="dxa"/>
-          </w:tcPr>
-          <w:p>
-            <w:pPr>
-              <w:jc w:val="both"/>
-              <w:rPr>
-                <w:noProof/>
-                <w:lang w:eastAsia="es-AR"/>
-              </w:rPr>
-            </w:pPr>
-            <w:r>
-              <w:rPr>
-                <w:noProof/>
-                <w:lang w:eastAsia="es-AR"/>
-              </w:rPr>
-              <w:drawing>
-                <wp:inline distT="0" distB="0" distL="0" distR="0" wp14:anchorId="497DBB05" wp14:editId="777C97F0">
-                  <wp:extent cx="1724025" cy="1361643"/>
-                  <wp:effectExtent l="0" t="0" r="0" b="0"/>
-                  <wp:docPr id="2" name="Imagen 2"/>
-                  <wp:cNvGraphicFramePr>
-                    <a:graphicFrameLocks xmlns:a="http://schemas.openxmlformats.org/drawingml/2006/main" noChangeAspect="1"/>
-                  </wp:cNvGraphicFramePr>
-                  <a:graphic xmlns:a="http://schemas.openxmlformats.org/drawingml/2006/main">
-                    <a:graphicData uri="http://schemas.openxmlformats.org/drawingml/2006/picture">
-                      <pic:pic xmlns:pic="http://schemas.openxmlformats.org/drawingml/2006/picture">
-                        <pic:nvPicPr>
-                          <pic:cNvPr id="1" name=""/>
-                          <pic:cNvPicPr/>
-                        </pic:nvPicPr>
-                        <pic:blipFill rotWithShape="1">
-                          <a:blip r:embed="rId11"/>
-                          <a:srcRect t="63130" r="85642" b="16700"/>
-                          <a:stretch/>
-                        </pic:blipFill>
-                        <pic:spPr bwMode="auto">
-                          <a:xfrm>
-                            <a:off x="0" y="0"/>
-                            <a:ext cx="1742459" cy="1376202"/>
-                          </a:xfrm>
-                          <a:prstGeom prst="rect">
-                            <a:avLst/>
-                          </a:prstGeom>
-                          <a:ln>
-                            <a:noFill/>
-                          </a:ln>
-                          <a:extLst>
-                            <a:ext uri="{53640926-AAD7-44D8-BBD7-CCE9431645EC}">
-                              <a14:shadowObscured xmlns:a14="http://schemas.microsoft.com/office/drawing/2010/main"/>
-                            </a:ext>
-                          </a:extLst>
-                        </pic:spPr>
-                      </pic:pic>
-                    </a:graphicData>
-                  </a:graphic>
-                </wp:inline>
-              </w:drawing>
-            </w:r>
-          </w:p>
-          <w:p>
-            <w:pPr>
-              <w:jc w:val="both"/>
-              <w:rPr>
-                <w:noProof/>
-                <w:lang w:eastAsia="es-AR"/>
-              </w:rPr>
-            </w:pPr>
-            <w:r>
-              <w:rPr>
-                <w:noProof/>
-                <w:lang w:eastAsia="es-AR"/>
-              </w:rPr>
-              <w:lastRenderedPageBreak/>
-              <w:drawing>
-                <wp:inline distT="0" distB="0" distL="0" distR="0" wp14:anchorId="4477C8DB" wp14:editId="42614370">
-                  <wp:extent cx="4890751" cy="1238250"/>
-                  <wp:effectExtent l="0" t="0" r="5715" b="0"/>
-                  <wp:docPr id="15" name="Imagen 15"/>
-                  <wp:cNvGraphicFramePr>
-                    <a:graphicFrameLocks xmlns:a="http://schemas.openxmlformats.org/drawingml/2006/main" noChangeAspect="1"/>
-                  </wp:cNvGraphicFramePr>
-                  <a:graphic xmlns:a="http://schemas.openxmlformats.org/drawingml/2006/main">
-                    <a:graphicData uri="http://schemas.openxmlformats.org/drawingml/2006/picture">
-                      <pic:pic xmlns:pic="http://schemas.openxmlformats.org/drawingml/2006/picture">
-                        <pic:nvPicPr>
-                          <pic:cNvPr id="1" name=""/>
-                          <pic:cNvPicPr/>
-                        </pic:nvPicPr>
-                        <pic:blipFill rotWithShape="1">
-                          <a:blip r:embed="rId12"/>
-                          <a:srcRect t="3302" r="52990" b="75528"/>
-                          <a:stretch/>
-                        </pic:blipFill>
-                        <pic:spPr bwMode="auto">
-                          <a:xfrm>
-                            <a:off x="0" y="0"/>
-                            <a:ext cx="4920127" cy="1245687"/>
-                          </a:xfrm>
-                          <a:prstGeom prst="rect">
-                            <a:avLst/>
-                          </a:prstGeom>
-                          <a:ln>
-                            <a:noFill/>
-                          </a:ln>
-                          <a:extLst>
-                            <a:ext uri="{53640926-AAD7-44D8-BBD7-CCE9431645EC}">
-                              <a14:shadowObscured xmlns:a14="http://schemas.microsoft.com/office/drawing/2010/main"/>
-                            </a:ext>
-                          </a:extLst>
-                        </pic:spPr>
-                      </pic:pic>
-                    </a:graphicData>
-                  </a:graphic>
-                </wp:inline>
-              </w:drawing>
-            </w:r>
-          </w:p>
-        </w:tc>
-      </w:tr>
     </w:tbl>
-    <w:p>
-      <w:pPr>
-        <w:jc w:val="both"/>
-        <w:rPr>
-          <w:noProof/>
-          <w:lang w:eastAsia="es-AR"/>
-        </w:rPr>
-      </w:pPr>
-    </w:p>
-    <w:p>
-      <w:pPr>
-        <w:jc w:val="both"/>
-      </w:pPr>
-    </w:p>
-    <w:p>
-      <w:pPr>
-        <w:jc w:val="both"/>
-      </w:pPr>
-      <w:bookmarkStart w:id="0" w:name="_GoBack"/>
-      <w:bookmarkEnd w:id="0"/>
-    </w:p>
     <w:p>
       <w:pPr>
         <w:jc w:val="both"/>
@@ -792,7 +625,28 @@
     <w:p>
       <w:pPr>
         <w:jc w:val="both"/>
+        <w:rPr>
+          <w:noProof/>
+          <w:lang w:eastAsia="es-AR"/>
+        </w:rPr>
       </w:pPr>
+    </w:p>
+    <w:p>
+      <w:pPr>
+        <w:jc w:val="both"/>
+        <w:rPr>
+          <w:noProof/>
+          <w:lang w:eastAsia="es-AR"/>
+        </w:rPr>
+      </w:pPr>
+    </w:p>
+    <w:p>
+      <w:pPr>
+        <w:jc w:val="both"/>
+      </w:pPr>
+      <w:r>
+        <w:tab/>
+      </w:r>
     </w:p>
     <w:sectPr>
       <w:pgSz w:w="11906" w:h="16838"/>

</xml_diff>